<commit_message>
court(cafc) answering-brief: a paragraph that anchors a footnote has no widow/orphan control in latex and docx (typst's rules do not see the note), instead of a typst rule; XENG-001..003 pass on latex and docx, params.cross_engine: gate (fb-595.54.6)
</commit_message>
<xml_diff>
--- a/courts/federal-circuit/court-of-appeals/answering-brief/docx/reference.docx
+++ b/courts/federal-circuit/court-of-appeals/answering-brief/docx/reference.docx
@@ -1206,6 +1206,14 @@
     <w:pPr>
       <w:keepNext/>
       <w:keepLines/>
+    </w:pPr>
+  </w:style>
+  <w:style w:type="paragraph" w:customStyle="1" w:styleId="BodyTextNote">
+    <w:name w:val="Body Text Note"/>
+    <w:basedOn w:val="BodyText"/>
+    <w:qFormat/>
+    <w:pPr>
+      <w:widowControl w:val="0"/>
     </w:pPr>
   </w:style>
 </w:styles>

</xml_diff>